<commit_message>
Added student info into and beautified the report
</commit_message>
<xml_diff>
--- a/242A007_Assignment1/Report.docx
+++ b/242A007_Assignment1/Report.docx
@@ -4,6 +4,43 @@
   <w:body>
     <w:p>
       <w:pPr>
+        <w:pStyle w:val="Title"/>
+        <w:spacing w:before="240" w:after="120"/>
+        <w:rPr>
+          <w:rFonts w:ascii="Liberation Serif" w:hAnsi="Liberation Serif"/>
+        </w:rPr>
+      </w:pPr>
+      <w:r>
+        <w:rPr>
+          <w:rFonts w:ascii="Liberation Serif" w:hAnsi="Liberation Serif"/>
+        </w:rPr>
+        <w:t>NLP Assignment 1</w:t>
+      </w:r>
+    </w:p>
+    <w:p>
+      <w:pPr>
+        <w:pStyle w:val="Heading4"/>
+        <w:jc w:val="center"/>
+        <w:rPr/>
+      </w:pPr>
+      <w:r>
+        <w:rPr/>
+        <w:t>Hassaan Shakeel Shaikh – 242A007</w:t>
+      </w:r>
+    </w:p>
+    <w:p>
+      <w:pPr>
+        <w:pStyle w:val="Heading4"/>
+        <w:jc w:val="center"/>
+        <w:rPr/>
+      </w:pPr>
+      <w:r>
+        <w:rPr/>
+        <w:t>Topic: Resume Parsing into JSON</w:t>
+      </w:r>
+    </w:p>
+    <w:p>
+      <w:pPr>
         <w:pStyle w:val="Heading2"/>
         <w:bidi w:val="0"/>
         <w:spacing w:before="200" w:after="120"/>
@@ -96,6 +133,7 @@
           <w:tab w:val="left" w:pos="709" w:leader="none"/>
         </w:tabs>
         <w:bidi w:val="0"/>
+        <w:spacing w:before="0" w:after="0"/>
         <w:ind w:hanging="283" w:start="709"/>
         <w:jc w:val="start"/>
         <w:rPr/>
@@ -116,6 +154,7 @@
           <w:tab w:val="left" w:pos="709" w:leader="none"/>
         </w:tabs>
         <w:bidi w:val="0"/>
+        <w:spacing w:before="0" w:after="0"/>
         <w:ind w:hanging="283" w:start="709"/>
         <w:jc w:val="start"/>
         <w:rPr/>
@@ -146,6 +185,7 @@
           <w:tab w:val="left" w:pos="709" w:leader="none"/>
         </w:tabs>
         <w:bidi w:val="0"/>
+        <w:spacing w:before="0" w:after="0"/>
         <w:ind w:hanging="283" w:start="709"/>
         <w:jc w:val="start"/>
         <w:rPr/>
@@ -166,6 +206,7 @@
           <w:tab w:val="left" w:pos="709" w:leader="none"/>
         </w:tabs>
         <w:bidi w:val="0"/>
+        <w:spacing w:before="0" w:after="0"/>
         <w:ind w:hanging="283" w:start="709"/>
         <w:jc w:val="start"/>
         <w:rPr/>
@@ -186,6 +227,7 @@
           <w:tab w:val="left" w:pos="709" w:leader="none"/>
         </w:tabs>
         <w:bidi w:val="0"/>
+        <w:spacing w:before="0" w:after="0"/>
         <w:ind w:hanging="283" w:start="709"/>
         <w:jc w:val="start"/>
         <w:rPr/>
@@ -206,6 +248,7 @@
           <w:tab w:val="left" w:pos="709" w:leader="none"/>
         </w:tabs>
         <w:bidi w:val="0"/>
+        <w:spacing w:before="0" w:after="0"/>
         <w:ind w:hanging="283" w:start="709"/>
         <w:jc w:val="start"/>
         <w:rPr/>
@@ -226,6 +269,7 @@
           <w:tab w:val="left" w:pos="709" w:leader="none"/>
         </w:tabs>
         <w:bidi w:val="0"/>
+        <w:spacing w:before="0" w:after="0"/>
         <w:ind w:hanging="283" w:start="709"/>
         <w:jc w:val="start"/>
         <w:rPr/>
@@ -246,6 +290,7 @@
           <w:tab w:val="left" w:pos="709" w:leader="none"/>
         </w:tabs>
         <w:bidi w:val="0"/>
+        <w:spacing w:before="0" w:after="0"/>
         <w:ind w:hanging="283" w:start="709"/>
         <w:jc w:val="start"/>
         <w:rPr/>
@@ -266,6 +311,7 @@
           <w:tab w:val="left" w:pos="709" w:leader="none"/>
         </w:tabs>
         <w:bidi w:val="0"/>
+        <w:spacing w:before="0" w:after="0"/>
         <w:ind w:hanging="283" w:start="709"/>
         <w:jc w:val="start"/>
         <w:rPr/>
@@ -286,6 +332,7 @@
           <w:tab w:val="left" w:pos="709" w:leader="none"/>
         </w:tabs>
         <w:bidi w:val="0"/>
+        <w:spacing w:before="0" w:after="0"/>
         <w:ind w:hanging="283" w:start="709"/>
         <w:jc w:val="start"/>
         <w:rPr/>
@@ -312,11 +359,63 @@
         <w:rPr/>
         <w:t xml:space="preserve"> </w:t>
       </w:r>
-      <w:r>
+    </w:p>
+    <w:p>
+      <w:pPr>
+        <w:pStyle w:val="BodyText"/>
+        <w:bidi w:val="0"/>
+        <w:jc w:val="start"/>
         <w:rPr>
           <w:rStyle w:val="SourceText"/>
         </w:rPr>
-        <w:t>screenshots/Input.png</w:t>
+      </w:pPr>
+      <w:r>
+        <w:rPr/>
+        <w:drawing>
+          <wp:anchor behindDoc="0" distT="0" distB="0" distL="0" distR="0" simplePos="0" locked="0" layoutInCell="0" allowOverlap="1" relativeHeight="2">
+            <wp:simplePos x="0" y="0"/>
+            <wp:positionH relativeFrom="column">
+              <wp:align>center</wp:align>
+            </wp:positionH>
+            <wp:positionV relativeFrom="paragraph">
+              <wp:posOffset>635</wp:posOffset>
+            </wp:positionV>
+            <wp:extent cx="5405120" cy="2917190"/>
+            <wp:effectExtent l="0" t="0" r="0" b="0"/>
+            <wp:wrapSquare wrapText="largest"/>
+            <wp:docPr id="1" name="Image1" descr="" title=""/>
+            <wp:cNvGraphicFramePr>
+              <a:graphicFrameLocks xmlns:a="http://schemas.openxmlformats.org/drawingml/2006/main" noChangeAspect="1"/>
+            </wp:cNvGraphicFramePr>
+            <a:graphic xmlns:a="http://schemas.openxmlformats.org/drawingml/2006/main">
+              <a:graphicData uri="http://schemas.openxmlformats.org/drawingml/2006/picture">
+                <pic:pic xmlns:pic="http://schemas.openxmlformats.org/drawingml/2006/picture">
+                  <pic:nvPicPr>
+                    <pic:cNvPr id="1" name="Image1" descr="" title=""/>
+                    <pic:cNvPicPr>
+                      <a:picLocks noChangeAspect="1" noChangeArrowheads="1"/>
+                    </pic:cNvPicPr>
+                  </pic:nvPicPr>
+                  <pic:blipFill>
+                    <a:blip r:embed="rId2"/>
+                    <a:stretch>
+                      <a:fillRect/>
+                    </a:stretch>
+                  </pic:blipFill>
+                  <pic:spPr bwMode="auto">
+                    <a:xfrm>
+                      <a:off x="0" y="0"/>
+                      <a:ext cx="5405120" cy="2917190"/>
+                    </a:xfrm>
+                    <a:prstGeom prst="rect">
+                      <a:avLst/>
+                    </a:prstGeom>
+                  </pic:spPr>
+                </pic:pic>
+              </a:graphicData>
+            </a:graphic>
+          </wp:anchor>
+        </w:drawing>
       </w:r>
     </w:p>
     <w:p>
@@ -400,15 +499,63 @@
         </w:rPr>
         <w:t>Output snapshot:</w:t>
       </w:r>
-      <w:r>
-        <w:rPr/>
-        <w:t xml:space="preserve"> </w:t>
-      </w:r>
-      <w:r>
-        <w:rPr>
-          <w:rStyle w:val="SourceText"/>
-        </w:rPr>
-        <w:t>screenshots/Output.png</w:t>
+    </w:p>
+    <w:p>
+      <w:pPr>
+        <w:pStyle w:val="BodyText"/>
+        <w:bidi w:val="0"/>
+        <w:jc w:val="start"/>
+        <w:rPr>
+          <w:rStyle w:val="Strong"/>
+        </w:rPr>
+      </w:pPr>
+      <w:r>
+        <w:rPr/>
+        <w:drawing>
+          <wp:anchor behindDoc="0" distT="0" distB="0" distL="0" distR="0" simplePos="0" locked="0" layoutInCell="0" allowOverlap="1" relativeHeight="3">
+            <wp:simplePos x="0" y="0"/>
+            <wp:positionH relativeFrom="column">
+              <wp:align>center</wp:align>
+            </wp:positionH>
+            <wp:positionV relativeFrom="paragraph">
+              <wp:posOffset>635</wp:posOffset>
+            </wp:positionV>
+            <wp:extent cx="6120130" cy="4643755"/>
+            <wp:effectExtent l="0" t="0" r="0" b="0"/>
+            <wp:wrapSquare wrapText="largest"/>
+            <wp:docPr id="2" name="Image2" descr="" title=""/>
+            <wp:cNvGraphicFramePr>
+              <a:graphicFrameLocks xmlns:a="http://schemas.openxmlformats.org/drawingml/2006/main" noChangeAspect="1"/>
+            </wp:cNvGraphicFramePr>
+            <a:graphic xmlns:a="http://schemas.openxmlformats.org/drawingml/2006/main">
+              <a:graphicData uri="http://schemas.openxmlformats.org/drawingml/2006/picture">
+                <pic:pic xmlns:pic="http://schemas.openxmlformats.org/drawingml/2006/picture">
+                  <pic:nvPicPr>
+                    <pic:cNvPr id="2" name="Image2" descr="" title=""/>
+                    <pic:cNvPicPr>
+                      <a:picLocks noChangeAspect="1" noChangeArrowheads="1"/>
+                    </pic:cNvPicPr>
+                  </pic:nvPicPr>
+                  <pic:blipFill>
+                    <a:blip r:embed="rId3"/>
+                    <a:stretch>
+                      <a:fillRect/>
+                    </a:stretch>
+                  </pic:blipFill>
+                  <pic:spPr bwMode="auto">
+                    <a:xfrm>
+                      <a:off x="0" y="0"/>
+                      <a:ext cx="6120130" cy="4643755"/>
+                    </a:xfrm>
+                    <a:prstGeom prst="rect">
+                      <a:avLst/>
+                    </a:prstGeom>
+                  </pic:spPr>
+                </pic:pic>
+              </a:graphicData>
+            </a:graphic>
+          </wp:anchor>
+        </w:drawing>
       </w:r>
     </w:p>
     <w:p>
@@ -765,6 +912,20 @@
       <w:r>
         <w:rPr/>
         <w:t>, providing additional evidence that the extraction was useful but not completely reliable.</w:t>
+      </w:r>
+    </w:p>
+    <w:p>
+      <w:pPr>
+        <w:pStyle w:val="Heading2"/>
+        <w:bidi w:val="0"/>
+        <w:jc w:val="start"/>
+        <w:rPr/>
+      </w:pPr>
+      <w:r>
+        <w:rPr/>
+      </w:r>
+      <w:r>
+        <w:br w:type="page"/>
       </w:r>
     </w:p>
     <w:p>
@@ -896,8 +1057,8 @@
       </w:tblPr>
       <w:tblGrid>
         <w:gridCol w:w="1540"/>
-        <w:gridCol w:w="1869"/>
-        <w:gridCol w:w="2365"/>
+        <w:gridCol w:w="1868"/>
+        <w:gridCol w:w="2366"/>
         <w:gridCol w:w="2285"/>
         <w:gridCol w:w="1579"/>
       </w:tblGrid>
@@ -922,7 +1083,7 @@
         </w:tc>
         <w:tc>
           <w:tcPr>
-            <w:tcW w:w="1869" w:type="dxa"/>
+            <w:tcW w:w="1868" w:type="dxa"/>
             <w:tcBorders/>
             <w:vAlign w:val="center"/>
           </w:tcPr>
@@ -939,7 +1100,7 @@
         </w:tc>
         <w:tc>
           <w:tcPr>
-            <w:tcW w:w="2365" w:type="dxa"/>
+            <w:tcW w:w="2366" w:type="dxa"/>
             <w:tcBorders/>
             <w:vAlign w:val="center"/>
           </w:tcPr>
@@ -1010,7 +1171,7 @@
         </w:tc>
         <w:tc>
           <w:tcPr>
-            <w:tcW w:w="1869" w:type="dxa"/>
+            <w:tcW w:w="1868" w:type="dxa"/>
             <w:tcBorders/>
             <w:vAlign w:val="center"/>
           </w:tcPr>
@@ -1027,7 +1188,7 @@
         </w:tc>
         <w:tc>
           <w:tcPr>
-            <w:tcW w:w="2365" w:type="dxa"/>
+            <w:tcW w:w="2366" w:type="dxa"/>
             <w:tcBorders/>
             <w:vAlign w:val="center"/>
           </w:tcPr>
@@ -1098,7 +1259,7 @@
         </w:tc>
         <w:tc>
           <w:tcPr>
-            <w:tcW w:w="1869" w:type="dxa"/>
+            <w:tcW w:w="1868" w:type="dxa"/>
             <w:tcBorders/>
             <w:vAlign w:val="center"/>
           </w:tcPr>
@@ -1121,7 +1282,7 @@
         </w:tc>
         <w:tc>
           <w:tcPr>
-            <w:tcW w:w="2365" w:type="dxa"/>
+            <w:tcW w:w="2366" w:type="dxa"/>
             <w:tcBorders/>
             <w:vAlign w:val="center"/>
           </w:tcPr>
@@ -1202,7 +1363,7 @@
         </w:tc>
         <w:tc>
           <w:tcPr>
-            <w:tcW w:w="1869" w:type="dxa"/>
+            <w:tcW w:w="1868" w:type="dxa"/>
             <w:tcBorders/>
             <w:vAlign w:val="center"/>
           </w:tcPr>
@@ -1219,7 +1380,7 @@
         </w:tc>
         <w:tc>
           <w:tcPr>
-            <w:tcW w:w="2365" w:type="dxa"/>
+            <w:tcW w:w="2366" w:type="dxa"/>
             <w:tcBorders/>
             <w:vAlign w:val="center"/>
           </w:tcPr>
@@ -1290,7 +1451,7 @@
         </w:tc>
         <w:tc>
           <w:tcPr>
-            <w:tcW w:w="1869" w:type="dxa"/>
+            <w:tcW w:w="1868" w:type="dxa"/>
             <w:tcBorders/>
             <w:vAlign w:val="center"/>
           </w:tcPr>
@@ -1307,7 +1468,7 @@
         </w:tc>
         <w:tc>
           <w:tcPr>
-            <w:tcW w:w="2365" w:type="dxa"/>
+            <w:tcW w:w="2366" w:type="dxa"/>
             <w:tcBorders/>
             <w:vAlign w:val="center"/>
           </w:tcPr>
@@ -1378,7 +1539,7 @@
         </w:tc>
         <w:tc>
           <w:tcPr>
-            <w:tcW w:w="1869" w:type="dxa"/>
+            <w:tcW w:w="1868" w:type="dxa"/>
             <w:tcBorders/>
             <w:vAlign w:val="center"/>
           </w:tcPr>
@@ -1395,7 +1556,7 @@
         </w:tc>
         <w:tc>
           <w:tcPr>
-            <w:tcW w:w="2365" w:type="dxa"/>
+            <w:tcW w:w="2366" w:type="dxa"/>
             <w:tcBorders/>
             <w:vAlign w:val="center"/>
           </w:tcPr>
@@ -1466,7 +1627,7 @@
         </w:tc>
         <w:tc>
           <w:tcPr>
-            <w:tcW w:w="1869" w:type="dxa"/>
+            <w:tcW w:w="1868" w:type="dxa"/>
             <w:tcBorders/>
             <w:vAlign w:val="center"/>
           </w:tcPr>
@@ -1483,7 +1644,7 @@
         </w:tc>
         <w:tc>
           <w:tcPr>
-            <w:tcW w:w="2365" w:type="dxa"/>
+            <w:tcW w:w="2366" w:type="dxa"/>
             <w:tcBorders/>
             <w:vAlign w:val="center"/>
           </w:tcPr>
@@ -1554,7 +1715,7 @@
         </w:tc>
         <w:tc>
           <w:tcPr>
-            <w:tcW w:w="1869" w:type="dxa"/>
+            <w:tcW w:w="1868" w:type="dxa"/>
             <w:tcBorders/>
             <w:vAlign w:val="center"/>
           </w:tcPr>
@@ -1571,7 +1732,7 @@
         </w:tc>
         <w:tc>
           <w:tcPr>
-            <w:tcW w:w="2365" w:type="dxa"/>
+            <w:tcW w:w="2366" w:type="dxa"/>
             <w:tcBorders/>
             <w:vAlign w:val="center"/>
           </w:tcPr>
@@ -1642,7 +1803,7 @@
         </w:tc>
         <w:tc>
           <w:tcPr>
-            <w:tcW w:w="1869" w:type="dxa"/>
+            <w:tcW w:w="1868" w:type="dxa"/>
             <w:tcBorders/>
             <w:vAlign w:val="center"/>
           </w:tcPr>
@@ -1669,7 +1830,7 @@
         </w:tc>
         <w:tc>
           <w:tcPr>
-            <w:tcW w:w="2365" w:type="dxa"/>
+            <w:tcW w:w="2366" w:type="dxa"/>
             <w:tcBorders/>
             <w:vAlign w:val="center"/>
           </w:tcPr>
@@ -1740,7 +1901,7 @@
         </w:tc>
         <w:tc>
           <w:tcPr>
-            <w:tcW w:w="1869" w:type="dxa"/>
+            <w:tcW w:w="1868" w:type="dxa"/>
             <w:tcBorders/>
             <w:vAlign w:val="center"/>
           </w:tcPr>
@@ -1757,7 +1918,7 @@
         </w:tc>
         <w:tc>
           <w:tcPr>
-            <w:tcW w:w="2365" w:type="dxa"/>
+            <w:tcW w:w="2366" w:type="dxa"/>
             <w:tcBorders/>
             <w:vAlign w:val="center"/>
           </w:tcPr>
@@ -1828,7 +1989,7 @@
         </w:tc>
         <w:tc>
           <w:tcPr>
-            <w:tcW w:w="1869" w:type="dxa"/>
+            <w:tcW w:w="1868" w:type="dxa"/>
             <w:tcBorders/>
             <w:vAlign w:val="center"/>
           </w:tcPr>
@@ -1845,7 +2006,7 @@
         </w:tc>
         <w:tc>
           <w:tcPr>
-            <w:tcW w:w="2365" w:type="dxa"/>
+            <w:tcW w:w="2366" w:type="dxa"/>
             <w:tcBorders/>
             <w:vAlign w:val="center"/>
           </w:tcPr>
@@ -1916,7 +2077,7 @@
         </w:tc>
         <w:tc>
           <w:tcPr>
-            <w:tcW w:w="1869" w:type="dxa"/>
+            <w:tcW w:w="1868" w:type="dxa"/>
             <w:tcBorders/>
             <w:vAlign w:val="center"/>
           </w:tcPr>
@@ -1933,7 +2094,7 @@
         </w:tc>
         <w:tc>
           <w:tcPr>
-            <w:tcW w:w="2365" w:type="dxa"/>
+            <w:tcW w:w="2366" w:type="dxa"/>
             <w:tcBorders/>
             <w:vAlign w:val="center"/>
           </w:tcPr>
@@ -2004,7 +2165,7 @@
         </w:tc>
         <w:tc>
           <w:tcPr>
-            <w:tcW w:w="1869" w:type="dxa"/>
+            <w:tcW w:w="1868" w:type="dxa"/>
             <w:tcBorders/>
             <w:vAlign w:val="center"/>
           </w:tcPr>
@@ -2021,7 +2182,7 @@
         </w:tc>
         <w:tc>
           <w:tcPr>
-            <w:tcW w:w="2365" w:type="dxa"/>
+            <w:tcW w:w="2366" w:type="dxa"/>
             <w:tcBorders/>
             <w:vAlign w:val="center"/>
           </w:tcPr>
@@ -2092,7 +2253,7 @@
         </w:tc>
         <w:tc>
           <w:tcPr>
-            <w:tcW w:w="1869" w:type="dxa"/>
+            <w:tcW w:w="1868" w:type="dxa"/>
             <w:tcBorders/>
             <w:vAlign w:val="center"/>
           </w:tcPr>
@@ -2109,7 +2270,7 @@
         </w:tc>
         <w:tc>
           <w:tcPr>
-            <w:tcW w:w="2365" w:type="dxa"/>
+            <w:tcW w:w="2366" w:type="dxa"/>
             <w:tcBorders/>
             <w:vAlign w:val="center"/>
           </w:tcPr>
@@ -2180,7 +2341,7 @@
         </w:tc>
         <w:tc>
           <w:tcPr>
-            <w:tcW w:w="1869" w:type="dxa"/>
+            <w:tcW w:w="1868" w:type="dxa"/>
             <w:tcBorders/>
             <w:vAlign w:val="center"/>
           </w:tcPr>
@@ -2197,7 +2358,7 @@
         </w:tc>
         <w:tc>
           <w:tcPr>
-            <w:tcW w:w="2365" w:type="dxa"/>
+            <w:tcW w:w="2366" w:type="dxa"/>
             <w:tcBorders/>
             <w:vAlign w:val="center"/>
           </w:tcPr>
@@ -2386,6 +2547,20 @@
       <w:r>
         <w:rPr/>
         <w:t>Both systems exhibited semantic over-extraction when identifying skills and both failed to preserve language proficiency. The experiment therefore demonstrates that commercial resume parsers can successfully convert unstructured resumes into useful JSON representations, but contextual and semantic information can still be lost or incorrectly classified.</w:t>
+      </w:r>
+    </w:p>
+    <w:p>
+      <w:pPr>
+        <w:pStyle w:val="Heading2"/>
+        <w:bidi w:val="0"/>
+        <w:jc w:val="start"/>
+        <w:rPr/>
+      </w:pPr>
+      <w:r>
+        <w:rPr/>
+      </w:r>
+      <w:r>
+        <w:br w:type="page"/>
       </w:r>
     </w:p>
     <w:p>
@@ -3084,6 +3259,18 @@
       <w:r>
         <w:rPr/>
         <w:t>A terminology normalization layer should map Hindi equivalents and English technical terms to the same canonical entities. This would allow both Hindi and English resumes to produce a consistent JSON structure.</w:t>
+      </w:r>
+    </w:p>
+    <w:p>
+      <w:pPr>
+        <w:pStyle w:val="Heading3"/>
+        <w:rPr/>
+      </w:pPr>
+      <w:r>
+        <w:rPr/>
+      </w:r>
+      <w:r>
+        <w:br w:type="page"/>
       </w:r>
     </w:p>
     <w:p>
@@ -3720,7 +3907,6 @@
     </w:lvl>
     <w:lvl w:ilvl="3">
       <w:start w:val="1"/>
-      <w:pStyle w:val="Heading4"/>
       <w:numFmt w:val="none"/>
       <w:suff w:val="nothing"/>
       <w:lvlText w:val=""/>
@@ -4022,6 +4208,21 @@
     </w:pPr>
     <w:rPr/>
   </w:style>
+  <w:style w:type="paragraph" w:styleId="Title">
+    <w:name w:val="Title"/>
+    <w:basedOn w:val="Heading"/>
+    <w:next w:val="BodyText"/>
+    <w:qFormat/>
+    <w:pPr>
+      <w:jc w:val="center"/>
+    </w:pPr>
+    <w:rPr>
+      <w:b/>
+      <w:bCs/>
+      <w:sz w:val="56"/>
+      <w:szCs w:val="56"/>
+    </w:rPr>
+  </w:style>
 </w:styles>
 </file>
 

</xml_diff>